<commit_message>
Moved init_LCD after GPIO init (really silly)
</commit_message>
<xml_diff>
--- a/EEE3096S SMTROS022 Pracs/Prac 3/Misc/EEE3096S 2025 Practical 3 Hand-in SMTROS022.docx
+++ b/EEE3096S SMTROS022 Pracs/Prac 3/Misc/EEE3096S 2025 Practical 3 Hand-in SMTROS022.docx
@@ -294,13 +294,7 @@
     <w:p/>
     <w:p>
       <w:r>
-        <w:t xml:space="preserve">Task 6: Compiler optimizations — test at least three </w:t>
-      </w:r>
-      <w:r>
-        <w:t>optimization</w:t>
-      </w:r>
-      <w:r>
-        <w:t xml:space="preserve"> levels (e.g., -O0, -O2, -</w:t>
+        <w:t>Task 6: Compiler optimizations — test at least three optimization levels (e.g., -O0, -O2, -</w:t>
       </w:r>
       <w:proofErr w:type="spellStart"/>
       <w:r>
@@ -774,13 +768,7 @@
         </w:rPr>
       </w:pPr>
       <w:r>
-        <w:t xml:space="preserve">This task showed that while very splitting the images had very little </w:t>
-      </w:r>
-      <w:r>
-        <w:t>effect</w:t>
-      </w:r>
-      <w:r>
-        <w:t xml:space="preserve"> on the processing time of the images, it allowed the processors to compute images at a resolution that wouldn’t have been possible due to memory issues.</w:t>
+        <w:t>This task showed that while very splitting the images had very little effect on the processing time of the images, it allowed the processors to compute images at a resolution that wouldn’t have been possible due to memory issues.</w:t>
       </w:r>
     </w:p>
     <w:p>
@@ -27064,23 +27052,7 @@
           <w:rFonts w:ascii="Courier New" w:hAnsi="Courier New" w:cs="Courier New"/>
           <w:lang w:val="en-ZA"/>
         </w:rPr>
-        <w:t xml:space="preserve">, int </w:t>
-      </w:r>
-      <w:proofErr w:type="spellStart"/>
-      <w:r>
-        <w:rPr>
-          <w:rFonts w:ascii="Courier New" w:hAnsi="Courier New" w:cs="Courier New"/>
-          <w:lang w:val="en-ZA"/>
-        </w:rPr>
-        <w:t>tile_height</w:t>
-      </w:r>
-      <w:proofErr w:type="spellEnd"/>
-      <w:r>
-        <w:rPr>
-          <w:rFonts w:ascii="Courier New" w:hAnsi="Courier New" w:cs="Courier New"/>
-          <w:lang w:val="en-ZA"/>
-        </w:rPr>
-        <w:t>,</w:t>
+        <w:t>, int tile_height,</w:t>
       </w:r>
     </w:p>
     <w:p>
@@ -34343,23 +34315,7 @@
           <w:rFonts w:ascii="Courier New" w:hAnsi="Courier New" w:cs="Courier New"/>
           <w:lang w:val="en-ZA"/>
         </w:rPr>
-        <w:t xml:space="preserve">, int </w:t>
-      </w:r>
-      <w:proofErr w:type="spellStart"/>
-      <w:r>
-        <w:rPr>
-          <w:rFonts w:ascii="Courier New" w:hAnsi="Courier New" w:cs="Courier New"/>
-          <w:lang w:val="en-ZA"/>
-        </w:rPr>
-        <w:t>tile_height</w:t>
-      </w:r>
-      <w:proofErr w:type="spellEnd"/>
-      <w:r>
-        <w:rPr>
-          <w:rFonts w:ascii="Courier New" w:hAnsi="Courier New" w:cs="Courier New"/>
-          <w:lang w:val="en-ZA"/>
-        </w:rPr>
-        <w:t>,</w:t>
+        <w:t>, int tile_height,</w:t>
       </w:r>
     </w:p>
     <w:p>
@@ -36357,23 +36313,7 @@
           <w:rFonts w:ascii="Courier New" w:hAnsi="Courier New" w:cs="Courier New"/>
           <w:lang w:val="en-ZA"/>
         </w:rPr>
-        <w:t xml:space="preserve">, </w:t>
-      </w:r>
-      <w:proofErr w:type="spellStart"/>
-      <w:r>
-        <w:rPr>
-          <w:rFonts w:ascii="Courier New" w:hAnsi="Courier New" w:cs="Courier New"/>
-          <w:lang w:val="en-ZA"/>
-        </w:rPr>
-        <w:t>current_tile_height</w:t>
-      </w:r>
-      <w:proofErr w:type="spellEnd"/>
-      <w:r>
-        <w:rPr>
-          <w:rFonts w:ascii="Courier New" w:hAnsi="Courier New" w:cs="Courier New"/>
-          <w:lang w:val="en-ZA"/>
-        </w:rPr>
-        <w:t>,</w:t>
+        <w:t>, current_tile_height,</w:t>
       </w:r>
     </w:p>
     <w:p>
@@ -41377,6 +41317,7 @@
   <w:style w:type="character" w:default="1" w:styleId="DefaultParagraphFont">
     <w:name w:val="Default Paragraph Font"/>
     <w:uiPriority w:val="1"/>
+    <w:semiHidden/>
     <w:unhideWhenUsed/>
   </w:style>
   <w:style w:type="table" w:default="1" w:styleId="TableNormal">

</xml_diff>